<commit_message>
feat: implement SPT update functionality with Zod validation, input sanitization, and Drive file management
</commit_message>
<xml_diff>
--- a/backend/template/1_Template_SPT_v1.docx
+++ b/backend/template/1_Template_SPT_v1.docx
@@ -12,31 +12,34 @@
       </w:pPr>
       <w:r>
         <w:rPr>
+          <w:rFonts w:ascii="Times New Roman" w:eastAsia="Times New Roman" w:hAnsi="Times New Roman" w:cs="Times New Roman"/>
+          <w:b/>
+          <w:bCs/>
           <w:noProof/>
         </w:rPr>
         <w:drawing>
-          <wp:anchor distT="114300" distB="114300" distL="114300" distR="114300" simplePos="0" relativeHeight="251658240" behindDoc="0" locked="0" layoutInCell="1" hidden="0" allowOverlap="1" wp14:anchorId="2328DB65" wp14:editId="7175683D">
+          <wp:anchor distT="114300" distB="114300" distL="114300" distR="114300" simplePos="0" relativeHeight="251659264" behindDoc="0" locked="0" layoutInCell="1" hidden="0" allowOverlap="1" wp14:anchorId="71B474A4" wp14:editId="6A90C03C">
             <wp:simplePos x="0" y="0"/>
             <wp:positionH relativeFrom="margin">
-              <wp:posOffset>-715799</wp:posOffset>
+              <wp:posOffset>-720725</wp:posOffset>
             </wp:positionH>
             <wp:positionV relativeFrom="margin">
-              <wp:posOffset>-809624</wp:posOffset>
+              <wp:posOffset>-825679</wp:posOffset>
             </wp:positionV>
             <wp:extent cx="7273834" cy="1223963"/>
-            <wp:effectExtent l="0" t="0" r="0" b="0"/>
+            <wp:effectExtent l="0" t="0" r="3810" b="0"/>
             <wp:wrapNone/>
-            <wp:docPr id="1" name="image1.png"/>
+            <wp:docPr id="1" name="image1.png" descr="A close-up of a sign&#10;&#10;AI-generated content may be incorrect."/>
             <wp:cNvGraphicFramePr/>
             <a:graphic xmlns:a="http://schemas.openxmlformats.org/drawingml/2006/main">
               <a:graphicData uri="http://schemas.openxmlformats.org/drawingml/2006/picture">
                 <pic:pic xmlns:pic="http://schemas.openxmlformats.org/drawingml/2006/picture">
                   <pic:nvPicPr>
-                    <pic:cNvPr id="0" name="image1.png"/>
+                    <pic:cNvPr id="1" name="image1.png" descr="A close-up of a sign&#10;&#10;AI-generated content may be incorrect."/>
                     <pic:cNvPicPr preferRelativeResize="0"/>
                   </pic:nvPicPr>
                   <pic:blipFill>
-                    <a:blip r:embed="rId4"/>
+                    <a:blip r:embed="rId5"/>
                     <a:srcRect/>
                     <a:stretch>
                       <a:fillRect/>
@@ -125,8 +128,9 @@
       <w:pPr>
         <w:widowControl w:val="0"/>
         <w:tabs>
-          <w:tab w:val="left" w:pos="1440"/>
-          <w:tab w:val="left" w:pos="1710"/>
+          <w:tab w:val="left" w:pos="1701"/>
+          <w:tab w:val="left" w:pos="1985"/>
+          <w:tab w:val="left" w:pos="2430"/>
         </w:tabs>
         <w:spacing w:line="240" w:lineRule="auto"/>
         <w:jc w:val="both"/>
@@ -135,215 +139,314 @@
         </w:rPr>
       </w:pPr>
     </w:p>
+    <w:tbl>
+      <w:tblPr>
+        <w:tblStyle w:val="TableGrid"/>
+        <w:tblW w:w="9067" w:type="dxa"/>
+        <w:tblBorders>
+          <w:top w:val="none" w:sz="0" w:space="0" w:color="auto"/>
+          <w:left w:val="none" w:sz="0" w:space="0" w:color="auto"/>
+          <w:bottom w:val="none" w:sz="0" w:space="0" w:color="auto"/>
+          <w:right w:val="none" w:sz="0" w:space="0" w:color="auto"/>
+          <w:insideH w:val="none" w:sz="0" w:space="0" w:color="auto"/>
+          <w:insideV w:val="none" w:sz="0" w:space="0" w:color="auto"/>
+        </w:tblBorders>
+        <w:tblLayout w:type="fixed"/>
+        <w:tblLook w:val="04A0" w:firstRow="1" w:lastRow="0" w:firstColumn="1" w:lastColumn="0" w:noHBand="0" w:noVBand="1"/>
+      </w:tblPr>
+      <w:tblGrid>
+        <w:gridCol w:w="1555"/>
+        <w:gridCol w:w="278"/>
+        <w:gridCol w:w="7234"/>
+      </w:tblGrid>
+      <w:tr>
+        <w:tc>
+          <w:tcPr>
+            <w:tcW w:w="1555" w:type="dxa"/>
+          </w:tcPr>
+          <w:p>
+            <w:pPr>
+              <w:widowControl w:val="0"/>
+              <w:tabs>
+                <w:tab w:val="left" w:pos="1701"/>
+                <w:tab w:val="left" w:pos="1985"/>
+                <w:tab w:val="left" w:pos="2430"/>
+              </w:tabs>
+              <w:spacing w:line="276" w:lineRule="auto"/>
+              <w:jc w:val="both"/>
+              <w:rPr>
+                <w:rFonts w:ascii="Times New Roman" w:eastAsia="Times New Roman" w:hAnsi="Times New Roman" w:cs="Times New Roman"/>
+              </w:rPr>
+            </w:pPr>
+            <w:r>
+              <w:rPr>
+                <w:rFonts w:ascii="Times New Roman" w:eastAsia="Times New Roman" w:hAnsi="Times New Roman" w:cs="Times New Roman"/>
+              </w:rPr>
+              <w:t>Menimbang</w:t>
+            </w:r>
+          </w:p>
+        </w:tc>
+        <w:tc>
+          <w:tcPr>
+            <w:tcW w:w="278" w:type="dxa"/>
+          </w:tcPr>
+          <w:p>
+            <w:pPr>
+              <w:widowControl w:val="0"/>
+              <w:tabs>
+                <w:tab w:val="left" w:pos="1701"/>
+                <w:tab w:val="left" w:pos="1985"/>
+                <w:tab w:val="left" w:pos="2430"/>
+              </w:tabs>
+              <w:spacing w:line="276" w:lineRule="auto"/>
+              <w:jc w:val="both"/>
+              <w:rPr>
+                <w:rFonts w:ascii="Times New Roman" w:eastAsia="Times New Roman" w:hAnsi="Times New Roman" w:cs="Times New Roman"/>
+              </w:rPr>
+            </w:pPr>
+            <w:r>
+              <w:rPr>
+                <w:rFonts w:ascii="Times New Roman" w:eastAsia="Times New Roman" w:hAnsi="Times New Roman" w:cs="Times New Roman"/>
+              </w:rPr>
+              <w:t>:</w:t>
+            </w:r>
+          </w:p>
+        </w:tc>
+        <w:tc>
+          <w:tcPr>
+            <w:tcW w:w="7234" w:type="dxa"/>
+          </w:tcPr>
+          <w:p>
+            <w:pPr>
+              <w:pStyle w:val="ListParagraph"/>
+              <w:widowControl w:val="0"/>
+              <w:numPr>
+                <w:ilvl w:val="0"/>
+                <w:numId w:val="1"/>
+              </w:numPr>
+              <w:tabs>
+                <w:tab w:val="left" w:pos="1701"/>
+                <w:tab w:val="left" w:pos="1985"/>
+                <w:tab w:val="left" w:pos="2430"/>
+              </w:tabs>
+              <w:spacing w:line="276" w:lineRule="auto"/>
+              <w:ind w:left="605"/>
+              <w:jc w:val="both"/>
+              <w:rPr>
+                <w:rFonts w:ascii="Times New Roman" w:eastAsia="Times New Roman" w:hAnsi="Times New Roman" w:cs="Times New Roman"/>
+              </w:rPr>
+            </w:pPr>
+            <w:r>
+              <w:rPr>
+                <w:rFonts w:ascii="Times New Roman" w:eastAsia="Times New Roman" w:hAnsi="Times New Roman" w:cs="Times New Roman"/>
+              </w:rPr>
+              <w:t>bahwa dalam rangka {{maksud_perjalanan}}.</w:t>
+            </w:r>
+          </w:p>
+          <w:p>
+            <w:pPr>
+              <w:pStyle w:val="ListParagraph"/>
+              <w:widowControl w:val="0"/>
+              <w:numPr>
+                <w:ilvl w:val="0"/>
+                <w:numId w:val="1"/>
+              </w:numPr>
+              <w:tabs>
+                <w:tab w:val="left" w:pos="1701"/>
+                <w:tab w:val="left" w:pos="1985"/>
+                <w:tab w:val="left" w:pos="2430"/>
+              </w:tabs>
+              <w:spacing w:line="276" w:lineRule="auto"/>
+              <w:ind w:left="605"/>
+              <w:jc w:val="both"/>
+              <w:rPr>
+                <w:rFonts w:ascii="Times New Roman" w:eastAsia="Times New Roman" w:hAnsi="Times New Roman" w:cs="Times New Roman"/>
+              </w:rPr>
+            </w:pPr>
+            <w:r>
+              <w:rPr>
+                <w:rFonts w:ascii="Times New Roman" w:eastAsia="Times New Roman" w:hAnsi="Times New Roman" w:cs="Times New Roman"/>
+              </w:rPr>
+              <w:t>bahwa untuk menjalankan kegiatan tersebut pada butir a, perlu menugaskan pegawai tersebut di bawah ini :</w:t>
+            </w:r>
+          </w:p>
+          <w:p>
+            <w:pPr>
+              <w:pStyle w:val="ListParagraph"/>
+              <w:widowControl w:val="0"/>
+              <w:tabs>
+                <w:tab w:val="left" w:pos="1701"/>
+                <w:tab w:val="left" w:pos="1985"/>
+                <w:tab w:val="left" w:pos="2430"/>
+              </w:tabs>
+              <w:spacing w:line="276" w:lineRule="auto"/>
+              <w:ind w:left="605"/>
+              <w:jc w:val="both"/>
+              <w:rPr>
+                <w:rFonts w:ascii="Times New Roman" w:eastAsia="Times New Roman" w:hAnsi="Times New Roman" w:cs="Times New Roman"/>
+              </w:rPr>
+            </w:pPr>
+          </w:p>
+        </w:tc>
+      </w:tr>
+      <w:tr>
+        <w:tc>
+          <w:tcPr>
+            <w:tcW w:w="1555" w:type="dxa"/>
+          </w:tcPr>
+          <w:p>
+            <w:pPr>
+              <w:widowControl w:val="0"/>
+              <w:tabs>
+                <w:tab w:val="left" w:pos="1701"/>
+                <w:tab w:val="left" w:pos="1985"/>
+                <w:tab w:val="left" w:pos="2430"/>
+              </w:tabs>
+              <w:spacing w:line="276" w:lineRule="auto"/>
+              <w:ind w:left="-101" w:firstLine="101"/>
+              <w:jc w:val="both"/>
+              <w:rPr>
+                <w:rFonts w:ascii="Times New Roman" w:eastAsia="Times New Roman" w:hAnsi="Times New Roman" w:cs="Times New Roman"/>
+              </w:rPr>
+            </w:pPr>
+            <w:r>
+              <w:rPr>
+                <w:rFonts w:ascii="Times New Roman" w:eastAsia="Times New Roman" w:hAnsi="Times New Roman" w:cs="Times New Roman"/>
+              </w:rPr>
+              <w:t>Dasar</w:t>
+            </w:r>
+          </w:p>
+        </w:tc>
+        <w:tc>
+          <w:tcPr>
+            <w:tcW w:w="278" w:type="dxa"/>
+          </w:tcPr>
+          <w:p>
+            <w:pPr>
+              <w:widowControl w:val="0"/>
+              <w:tabs>
+                <w:tab w:val="left" w:pos="1701"/>
+                <w:tab w:val="left" w:pos="1985"/>
+                <w:tab w:val="left" w:pos="2430"/>
+              </w:tabs>
+              <w:spacing w:line="276" w:lineRule="auto"/>
+              <w:jc w:val="both"/>
+              <w:rPr>
+                <w:rFonts w:ascii="Times New Roman" w:eastAsia="Times New Roman" w:hAnsi="Times New Roman" w:cs="Times New Roman"/>
+              </w:rPr>
+            </w:pPr>
+            <w:r>
+              <w:rPr>
+                <w:rFonts w:ascii="Times New Roman" w:eastAsia="Times New Roman" w:hAnsi="Times New Roman" w:cs="Times New Roman"/>
+              </w:rPr>
+              <w:t>:</w:t>
+            </w:r>
+          </w:p>
+        </w:tc>
+        <w:tc>
+          <w:tcPr>
+            <w:tcW w:w="7234" w:type="dxa"/>
+          </w:tcPr>
+          <w:p>
+            <w:pPr>
+              <w:pStyle w:val="ListParagraph"/>
+              <w:widowControl w:val="0"/>
+              <w:numPr>
+                <w:ilvl w:val="0"/>
+                <w:numId w:val="2"/>
+              </w:numPr>
+              <w:tabs>
+                <w:tab w:val="left" w:pos="1701"/>
+                <w:tab w:val="left" w:pos="1985"/>
+                <w:tab w:val="left" w:pos="2430"/>
+              </w:tabs>
+              <w:spacing w:line="276" w:lineRule="auto"/>
+              <w:ind w:left="605"/>
+              <w:jc w:val="both"/>
+              <w:rPr>
+                <w:rFonts w:ascii="Times New Roman" w:eastAsia="Times New Roman" w:hAnsi="Times New Roman" w:cs="Times New Roman"/>
+              </w:rPr>
+            </w:pPr>
+            <w:r>
+              <w:rPr>
+                <w:rFonts w:ascii="Times New Roman" w:eastAsia="Times New Roman" w:hAnsi="Times New Roman" w:cs="Times New Roman"/>
+              </w:rPr>
+              <w:t>Peraturan Menteri Pertanian Nomor 02 Tahun 2025 tanggal 08 Januari 2025 tentang Organisasi dan Tata Kerja Kementerian Pertanian.</w:t>
+            </w:r>
+          </w:p>
+          <w:p>
+            <w:pPr>
+              <w:pStyle w:val="ListParagraph"/>
+              <w:widowControl w:val="0"/>
+              <w:numPr>
+                <w:ilvl w:val="0"/>
+                <w:numId w:val="2"/>
+              </w:numPr>
+              <w:tabs>
+                <w:tab w:val="left" w:pos="1701"/>
+                <w:tab w:val="left" w:pos="1985"/>
+                <w:tab w:val="left" w:pos="2430"/>
+              </w:tabs>
+              <w:spacing w:line="276" w:lineRule="auto"/>
+              <w:ind w:left="605"/>
+              <w:jc w:val="both"/>
+              <w:rPr>
+                <w:rFonts w:ascii="Times New Roman" w:eastAsia="Times New Roman" w:hAnsi="Times New Roman" w:cs="Times New Roman"/>
+              </w:rPr>
+            </w:pPr>
+            <w:r>
+              <w:rPr>
+                <w:rFonts w:ascii="Times New Roman" w:eastAsia="Times New Roman" w:hAnsi="Times New Roman" w:cs="Times New Roman"/>
+              </w:rPr>
+              <w:t>Keputusan Menteri Pertanian Nomor : 923/Kpts/KP.230/M/12/2022 tanggal tentang Pemberhentian, Pemindahan dan Pengangkatan dalam Jabatan Pimpinan Tinggi Pratama Di lingkungan Kementerian Pertanian.</w:t>
+            </w:r>
+          </w:p>
+          <w:p>
+            <w:pPr>
+              <w:pStyle w:val="ListParagraph"/>
+              <w:widowControl w:val="0"/>
+              <w:numPr>
+                <w:ilvl w:val="0"/>
+                <w:numId w:val="2"/>
+              </w:numPr>
+              <w:tabs>
+                <w:tab w:val="left" w:pos="1701"/>
+                <w:tab w:val="left" w:pos="1985"/>
+                <w:tab w:val="left" w:pos="2430"/>
+              </w:tabs>
+              <w:spacing w:line="276" w:lineRule="auto"/>
+              <w:ind w:left="605"/>
+              <w:jc w:val="both"/>
+              <w:rPr>
+                <w:rFonts w:ascii="Times New Roman" w:eastAsia="Times New Roman" w:hAnsi="Times New Roman" w:cs="Times New Roman"/>
+              </w:rPr>
+            </w:pPr>
+            <w:r>
+              <w:rPr>
+                <w:rFonts w:ascii="Times New Roman" w:eastAsia="Times New Roman" w:hAnsi="Times New Roman" w:cs="Times New Roman"/>
+              </w:rPr>
+              <w:t>Daftar Isian Pelaksanaan Anggaran (DIPA) Petikan Satker (691321) Direktorat Jenderal Lahan dan Irigasi Pertanian TA. 225 NOMOR : SP DIPA- 018.13.1.691321/2025 Tanggal 1 Desember 2025.</w:t>
+            </w:r>
+          </w:p>
+        </w:tc>
+      </w:tr>
+    </w:tbl>
     <w:p>
       <w:pPr>
         <w:widowControl w:val="0"/>
         <w:tabs>
-          <w:tab w:val="left" w:pos="1701"/>
-          <w:tab w:val="left" w:pos="1985"/>
-          <w:tab w:val="left" w:pos="2410"/>
+          <w:tab w:val="left" w:pos="1276"/>
+          <w:tab w:val="left" w:pos="1440"/>
+          <w:tab w:val="left" w:pos="1620"/>
+          <w:tab w:val="left" w:pos="1800"/>
+          <w:tab w:val="left" w:pos="2520"/>
         </w:tabs>
         <w:spacing w:line="240" w:lineRule="auto"/>
-        <w:ind w:left="2410"/>
-        <w:jc w:val="both"/>
+        <w:ind w:right="390"/>
         <w:rPr>
           <w:rFonts w:ascii="Times New Roman" w:eastAsia="Times New Roman" w:hAnsi="Times New Roman" w:cs="Times New Roman"/>
         </w:rPr>
       </w:pPr>
-      <w:r>
-        <w:rPr>
-          <w:rFonts w:ascii="Times New Roman" w:eastAsia="Times New Roman" w:hAnsi="Times New Roman" w:cs="Times New Roman"/>
-        </w:rPr>
-        <w:t>Menimbang</w:t>
-      </w:r>
-      <w:r>
-        <w:rPr>
-          <w:rFonts w:ascii="Times New Roman" w:eastAsia="Times New Roman" w:hAnsi="Times New Roman" w:cs="Times New Roman"/>
-        </w:rPr>
-        <w:tab/>
-        <w:t xml:space="preserve">: </w:t>
-      </w:r>
-      <w:r>
-        <w:rPr>
-          <w:rFonts w:ascii="Times New Roman" w:eastAsia="Times New Roman" w:hAnsi="Times New Roman" w:cs="Times New Roman"/>
-        </w:rPr>
-        <w:tab/>
-        <w:t>a.</w:t>
-      </w:r>
-      <w:r>
-        <w:rPr>
-          <w:rFonts w:ascii="Times New Roman" w:eastAsia="Times New Roman" w:hAnsi="Times New Roman" w:cs="Times New Roman"/>
-        </w:rPr>
-        <w:tab/>
-        <w:t>bahwa dalam rangka {{maksud_perjalanan}}.</w:t>
-      </w:r>
-    </w:p>
-    <w:p>
-      <w:pPr>
-        <w:widowControl w:val="0"/>
-        <w:tabs>
-          <w:tab w:val="left" w:pos="1701"/>
-          <w:tab w:val="left" w:pos="1985"/>
-          <w:tab w:val="left" w:pos="2410"/>
-        </w:tabs>
-        <w:spacing w:line="240" w:lineRule="auto"/>
-        <w:ind w:left="2410"/>
-        <w:jc w:val="both"/>
-        <w:rPr>
-          <w:rFonts w:ascii="Times New Roman" w:eastAsia="Times New Roman" w:hAnsi="Times New Roman" w:cs="Times New Roman"/>
-        </w:rPr>
-      </w:pPr>
-      <w:r>
-        <w:rPr>
-          <w:rFonts w:ascii="Times New Roman" w:eastAsia="Times New Roman" w:hAnsi="Times New Roman" w:cs="Times New Roman"/>
-        </w:rPr>
-        <w:tab/>
-      </w:r>
-      <w:r>
-        <w:rPr>
-          <w:rFonts w:ascii="Times New Roman" w:eastAsia="Times New Roman" w:hAnsi="Times New Roman" w:cs="Times New Roman"/>
-        </w:rPr>
-        <w:tab/>
-        <w:t>b.</w:t>
-      </w:r>
-      <w:r>
-        <w:rPr>
-          <w:rFonts w:ascii="Times New Roman" w:eastAsia="Times New Roman" w:hAnsi="Times New Roman" w:cs="Times New Roman"/>
-        </w:rPr>
-        <w:tab/>
-        <w:t xml:space="preserve">bahwa untuk menjalankan kegiatan tersebut pada butir a, perlu menugaskan pegawai tersebut di bawah ini : </w:t>
-      </w:r>
-    </w:p>
-    <w:p>
-      <w:pPr>
-        <w:widowControl w:val="0"/>
-        <w:tabs>
-          <w:tab w:val="left" w:pos="1701"/>
-          <w:tab w:val="left" w:pos="1985"/>
-          <w:tab w:val="left" w:pos="2410"/>
-        </w:tabs>
-        <w:spacing w:line="240" w:lineRule="auto"/>
-        <w:ind w:left="2410"/>
-        <w:jc w:val="both"/>
-        <w:rPr>
-          <w:rFonts w:ascii="Times New Roman" w:eastAsia="Times New Roman" w:hAnsi="Times New Roman" w:cs="Times New Roman"/>
-        </w:rPr>
-      </w:pPr>
-    </w:p>
-    <w:p>
-      <w:pPr>
-        <w:widowControl w:val="0"/>
-        <w:tabs>
-          <w:tab w:val="left" w:pos="1701"/>
-          <w:tab w:val="left" w:pos="1985"/>
-          <w:tab w:val="left" w:pos="2410"/>
-        </w:tabs>
-        <w:spacing w:line="240" w:lineRule="auto"/>
-        <w:ind w:left="2410"/>
-        <w:jc w:val="both"/>
-        <w:rPr>
-          <w:rFonts w:ascii="Times New Roman" w:eastAsia="Times New Roman" w:hAnsi="Times New Roman" w:cs="Times New Roman"/>
-        </w:rPr>
-      </w:pPr>
-      <w:r>
-        <w:rPr>
-          <w:rFonts w:ascii="Times New Roman" w:eastAsia="Times New Roman" w:hAnsi="Times New Roman" w:cs="Times New Roman"/>
-        </w:rPr>
-        <w:t>Dasar</w:t>
-      </w:r>
-      <w:r>
-        <w:rPr>
-          <w:rFonts w:ascii="Times New Roman" w:eastAsia="Times New Roman" w:hAnsi="Times New Roman" w:cs="Times New Roman"/>
-        </w:rPr>
-        <w:tab/>
-        <w:t xml:space="preserve">:  </w:t>
-      </w:r>
-      <w:r>
-        <w:rPr>
-          <w:rFonts w:ascii="Times New Roman" w:eastAsia="Times New Roman" w:hAnsi="Times New Roman" w:cs="Times New Roman"/>
-        </w:rPr>
-        <w:tab/>
-        <w:t>1.</w:t>
-      </w:r>
-      <w:r>
-        <w:rPr>
-          <w:rFonts w:ascii="Times New Roman" w:eastAsia="Times New Roman" w:hAnsi="Times New Roman" w:cs="Times New Roman"/>
-        </w:rPr>
-        <w:tab/>
-        <w:t>Peraturan Menteri Pertanian Nomor 02 Tahun 2025 tanggal 08 Januari 2025 tentang Organisasi dan Tata Kerja Kementerian Pertanian.</w:t>
-      </w:r>
-    </w:p>
-    <w:p>
-      <w:pPr>
-        <w:widowControl w:val="0"/>
-        <w:tabs>
-          <w:tab w:val="left" w:pos="1701"/>
-          <w:tab w:val="left" w:pos="1985"/>
-          <w:tab w:val="left" w:pos="2410"/>
-        </w:tabs>
-        <w:spacing w:line="240" w:lineRule="auto"/>
-        <w:ind w:left="2410"/>
-        <w:jc w:val="both"/>
-        <w:rPr>
-          <w:rFonts w:ascii="Times New Roman" w:eastAsia="Times New Roman" w:hAnsi="Times New Roman" w:cs="Times New Roman"/>
-        </w:rPr>
-      </w:pPr>
-      <w:r>
-        <w:rPr>
-          <w:rFonts w:ascii="Times New Roman" w:eastAsia="Times New Roman" w:hAnsi="Times New Roman" w:cs="Times New Roman"/>
-        </w:rPr>
-        <w:tab/>
-      </w:r>
-      <w:r>
-        <w:rPr>
-          <w:rFonts w:ascii="Times New Roman" w:eastAsia="Times New Roman" w:hAnsi="Times New Roman" w:cs="Times New Roman"/>
-        </w:rPr>
-        <w:tab/>
-        <w:t>2.</w:t>
-      </w:r>
-      <w:r>
-        <w:rPr>
-          <w:rFonts w:ascii="Times New Roman" w:eastAsia="Times New Roman" w:hAnsi="Times New Roman" w:cs="Times New Roman"/>
-        </w:rPr>
-        <w:tab/>
-        <w:t>Keputusan Menteri Pertanian Nomor : 923/Kpts/KP.230/M/12/2022 tanggal tentang Pemberhentian, Pemindahan dan Pengangkatan dalam Jabatan Pimpinan Tinggi Pratama Di lingkungan Kementerian Pertanian.</w:t>
-      </w:r>
-    </w:p>
-    <w:p>
-      <w:pPr>
-        <w:widowControl w:val="0"/>
-        <w:tabs>
-          <w:tab w:val="left" w:pos="1701"/>
-          <w:tab w:val="left" w:pos="1985"/>
-          <w:tab w:val="left" w:pos="2430"/>
-        </w:tabs>
-        <w:spacing w:line="240" w:lineRule="auto"/>
-        <w:ind w:left="2410"/>
-        <w:jc w:val="both"/>
-        <w:rPr>
-          <w:rFonts w:ascii="Times New Roman" w:eastAsia="Times New Roman" w:hAnsi="Times New Roman" w:cs="Times New Roman"/>
-        </w:rPr>
-      </w:pPr>
-      <w:r>
-        <w:rPr>
-          <w:rFonts w:ascii="Times New Roman" w:eastAsia="Times New Roman" w:hAnsi="Times New Roman" w:cs="Times New Roman"/>
-        </w:rPr>
-        <w:tab/>
-      </w:r>
-      <w:r>
-        <w:rPr>
-          <w:rFonts w:ascii="Times New Roman" w:eastAsia="Times New Roman" w:hAnsi="Times New Roman" w:cs="Times New Roman"/>
-        </w:rPr>
-        <w:tab/>
-        <w:t>3.</w:t>
-      </w:r>
-      <w:r>
-        <w:rPr>
-          <w:rFonts w:ascii="Times New Roman" w:eastAsia="Times New Roman" w:hAnsi="Times New Roman" w:cs="Times New Roman"/>
-        </w:rPr>
-        <w:tab/>
-        <w:t>Daftar Isian Pelaksanaan Anggaran (DIPA) Petikan Satker (691321) Direktorat Jenderal Lahan dan Irigasi Pertanian TA. 225 NOMOR : SP DIPA- 018.13.1.691321/2025 Tanggal 1 Desember 2025.</w:t>
-      </w:r>
     </w:p>
     <w:p>
       <w:pPr>
@@ -362,6 +465,12 @@
           <w:rFonts w:ascii="Times New Roman" w:eastAsia="Times New Roman" w:hAnsi="Times New Roman" w:cs="Times New Roman"/>
         </w:rPr>
       </w:pPr>
+      <w:r>
+        <w:rPr>
+          <w:rFonts w:ascii="Times New Roman" w:eastAsia="Times New Roman" w:hAnsi="Times New Roman" w:cs="Times New Roman"/>
+        </w:rPr>
+        <w:t>Memberi Tugas :</w:t>
+      </w:r>
     </w:p>
     <w:p>
       <w:pPr>
@@ -380,43 +489,94 @@
           <w:rFonts w:ascii="Times New Roman" w:eastAsia="Times New Roman" w:hAnsi="Times New Roman" w:cs="Times New Roman"/>
         </w:rPr>
       </w:pPr>
-      <w:r>
-        <w:rPr>
-          <w:rFonts w:ascii="Times New Roman" w:eastAsia="Times New Roman" w:hAnsi="Times New Roman" w:cs="Times New Roman"/>
-        </w:rPr>
-        <w:t>Memberi Tugas :</w:t>
-      </w:r>
     </w:p>
-    <w:p>
-      <w:pPr>
-        <w:widowControl w:val="0"/>
-        <w:tabs>
-          <w:tab w:val="left" w:pos="1701"/>
-          <w:tab w:val="left" w:pos="1800"/>
-          <w:tab w:val="left" w:pos="1843"/>
-          <w:tab w:val="left" w:pos="2410"/>
-        </w:tabs>
-        <w:spacing w:line="240" w:lineRule="auto"/>
-        <w:ind w:right="391"/>
-        <w:jc w:val="both"/>
-        <w:rPr>
-          <w:rFonts w:ascii="Times New Roman" w:eastAsia="Times New Roman" w:hAnsi="Times New Roman" w:cs="Times New Roman"/>
-        </w:rPr>
-      </w:pPr>
-      <w:r>
-        <w:rPr>
-          <w:rFonts w:ascii="Times New Roman" w:eastAsia="Times New Roman" w:hAnsi="Times New Roman" w:cs="Times New Roman"/>
-        </w:rPr>
-        <w:t>Kepada</w:t>
-      </w:r>
-      <w:r>
-        <w:rPr>
-          <w:rFonts w:ascii="Times New Roman" w:eastAsia="Times New Roman" w:hAnsi="Times New Roman" w:cs="Times New Roman"/>
-        </w:rPr>
-        <w:tab/>
-        <w:t>:</w:t>
-      </w:r>
-    </w:p>
+    <w:tbl>
+      <w:tblPr>
+        <w:tblStyle w:val="TableGrid"/>
+        <w:tblW w:w="9067" w:type="dxa"/>
+        <w:tblBorders>
+          <w:top w:val="none" w:sz="0" w:space="0" w:color="auto"/>
+          <w:left w:val="none" w:sz="0" w:space="0" w:color="auto"/>
+          <w:bottom w:val="none" w:sz="0" w:space="0" w:color="auto"/>
+          <w:right w:val="none" w:sz="0" w:space="0" w:color="auto"/>
+          <w:insideH w:val="none" w:sz="0" w:space="0" w:color="auto"/>
+          <w:insideV w:val="none" w:sz="0" w:space="0" w:color="auto"/>
+        </w:tblBorders>
+        <w:tblLook w:val="04A0" w:firstRow="1" w:lastRow="0" w:firstColumn="1" w:lastColumn="0" w:noHBand="0" w:noVBand="1"/>
+      </w:tblPr>
+      <w:tblGrid>
+        <w:gridCol w:w="1555"/>
+        <w:gridCol w:w="283"/>
+        <w:gridCol w:w="7229"/>
+      </w:tblGrid>
+      <w:tr>
+        <w:tc>
+          <w:tcPr>
+            <w:tcW w:w="1555" w:type="dxa"/>
+          </w:tcPr>
+          <w:p>
+            <w:pPr>
+              <w:widowControl w:val="0"/>
+              <w:tabs>
+                <w:tab w:val="left" w:pos="1701"/>
+                <w:tab w:val="left" w:pos="1985"/>
+                <w:tab w:val="left" w:pos="2410"/>
+              </w:tabs>
+              <w:spacing w:line="276" w:lineRule="auto"/>
+              <w:jc w:val="both"/>
+              <w:rPr>
+                <w:rFonts w:ascii="Times New Roman" w:eastAsia="Times New Roman" w:hAnsi="Times New Roman" w:cs="Times New Roman"/>
+              </w:rPr>
+            </w:pPr>
+            <w:r>
+              <w:rPr>
+                <w:rFonts w:ascii="Times New Roman" w:eastAsia="Times New Roman" w:hAnsi="Times New Roman" w:cs="Times New Roman"/>
+              </w:rPr>
+              <w:t>Kepada</w:t>
+            </w:r>
+          </w:p>
+        </w:tc>
+        <w:tc>
+          <w:tcPr>
+            <w:tcW w:w="283" w:type="dxa"/>
+          </w:tcPr>
+          <w:p>
+            <w:pPr>
+              <w:widowControl w:val="0"/>
+              <w:tabs>
+                <w:tab w:val="left" w:pos="1701"/>
+                <w:tab w:val="left" w:pos="1985"/>
+                <w:tab w:val="left" w:pos="2410"/>
+              </w:tabs>
+              <w:spacing w:line="276" w:lineRule="auto"/>
+              <w:jc w:val="both"/>
+              <w:rPr>
+                <w:rFonts w:ascii="Times New Roman" w:eastAsia="Times New Roman" w:hAnsi="Times New Roman" w:cs="Times New Roman"/>
+              </w:rPr>
+            </w:pPr>
+            <w:r>
+              <w:rPr>
+                <w:rFonts w:ascii="Times New Roman" w:eastAsia="Times New Roman" w:hAnsi="Times New Roman" w:cs="Times New Roman"/>
+              </w:rPr>
+              <w:t>:</w:t>
+            </w:r>
+          </w:p>
+        </w:tc>
+        <w:tc>
+          <w:tcPr>
+            <w:tcW w:w="7229" w:type="dxa"/>
+          </w:tcPr>
+          <w:p>
+            <w:pPr>
+              <w:jc w:val="both"/>
+              <w:rPr>
+                <w:rFonts w:ascii="Times New Roman" w:eastAsia="Times New Roman" w:hAnsi="Times New Roman" w:cs="Times New Roman"/>
+              </w:rPr>
+            </w:pPr>
+          </w:p>
+        </w:tc>
+      </w:tr>
+    </w:tbl>
     <w:p>
       <w:pPr>
         <w:widowControl w:val="0"/>
@@ -655,6 +815,7 @@
             <w:pPr>
               <w:widowControl w:val="0"/>
               <w:spacing w:line="240" w:lineRule="auto"/>
+              <w:jc w:val="center"/>
               <w:rPr>
                 <w:rFonts w:ascii="Times New Roman" w:eastAsia="Times New Roman" w:hAnsi="Times New Roman" w:cs="Times New Roman"/>
                 <w:sz w:val="20"/>
@@ -668,6 +829,14 @@
                 <w:szCs w:val="20"/>
               </w:rPr>
               <w:t>{{#peserta}}{{no}}</w:t>
+            </w:r>
+            <w:r>
+              <w:rPr>
+                <w:rFonts w:ascii="Times New Roman" w:eastAsia="Times New Roman" w:hAnsi="Times New Roman" w:cs="Times New Roman"/>
+                <w:sz w:val="20"/>
+                <w:szCs w:val="20"/>
+              </w:rPr>
+              <w:t>.</w:t>
             </w:r>
           </w:p>
         </w:tc>
@@ -833,111 +1002,155 @@
           <w:rFonts w:ascii="Times New Roman" w:eastAsia="Times New Roman" w:hAnsi="Times New Roman" w:cs="Times New Roman"/>
         </w:rPr>
       </w:pPr>
-      <w:r>
-        <w:rPr>
-          <w:rFonts w:ascii="Times New Roman" w:eastAsia="Times New Roman" w:hAnsi="Times New Roman" w:cs="Times New Roman"/>
-        </w:rPr>
-        <w:t>Untuk</w:t>
-      </w:r>
-      <w:r>
-        <w:rPr>
-          <w:rFonts w:ascii="Times New Roman" w:eastAsia="Times New Roman" w:hAnsi="Times New Roman" w:cs="Times New Roman"/>
-        </w:rPr>
-        <w:tab/>
-        <w:t>:</w:t>
-      </w:r>
-      <w:r>
-        <w:rPr>
-          <w:rFonts w:ascii="Times New Roman" w:eastAsia="Times New Roman" w:hAnsi="Times New Roman" w:cs="Times New Roman"/>
-        </w:rPr>
-        <w:tab/>
-        <w:t>1.</w:t>
-      </w:r>
-      <w:r>
-        <w:rPr>
-          <w:rFonts w:ascii="Times New Roman" w:eastAsia="Times New Roman" w:hAnsi="Times New Roman" w:cs="Times New Roman"/>
-        </w:rPr>
-        <w:tab/>
-        <w:t>Melaksanakan tugas dalam rangka {{kegiatan}}.</w:t>
-      </w:r>
     </w:p>
-    <w:p>
-      <w:pPr>
-        <w:widowControl w:val="0"/>
-        <w:tabs>
-          <w:tab w:val="left" w:pos="1701"/>
-          <w:tab w:val="left" w:pos="1985"/>
-          <w:tab w:val="left" w:pos="2410"/>
-        </w:tabs>
-        <w:spacing w:line="240" w:lineRule="auto"/>
-        <w:ind w:left="2410" w:right="-188"/>
-        <w:jc w:val="both"/>
-        <w:rPr>
-          <w:rFonts w:ascii="Times New Roman" w:eastAsia="Times New Roman" w:hAnsi="Times New Roman" w:cs="Times New Roman"/>
-        </w:rPr>
-      </w:pPr>
-      <w:r>
-        <w:rPr>
-          <w:rFonts w:ascii="Times New Roman" w:eastAsia="Times New Roman" w:hAnsi="Times New Roman" w:cs="Times New Roman"/>
-        </w:rPr>
-        <w:tab/>
-      </w:r>
-      <w:r>
-        <w:rPr>
-          <w:rFonts w:ascii="Times New Roman" w:eastAsia="Times New Roman" w:hAnsi="Times New Roman" w:cs="Times New Roman"/>
-        </w:rPr>
-        <w:tab/>
-        <w:t xml:space="preserve">2. </w:t>
-      </w:r>
-      <w:r>
-        <w:rPr>
-          <w:rFonts w:ascii="Times New Roman" w:eastAsia="Times New Roman" w:hAnsi="Times New Roman" w:cs="Times New Roman"/>
-        </w:rPr>
-        <w:tab/>
-        <w:t>Biaya perjalanan dinas diberikan pada DIPA Petikan Satker (018.13) Direktorat Jenderal Lahan dan Irigasi Pertanian TA.2025</w:t>
-      </w:r>
-    </w:p>
-    <w:p>
-      <w:pPr>
-        <w:widowControl w:val="0"/>
-        <w:spacing w:line="240" w:lineRule="auto"/>
-        <w:ind w:left="2410"/>
-        <w:jc w:val="both"/>
-        <w:rPr>
-          <w:rFonts w:ascii="Times New Roman" w:eastAsia="Times New Roman" w:hAnsi="Times New Roman" w:cs="Times New Roman"/>
-        </w:rPr>
-      </w:pPr>
-      <w:r>
-        <w:rPr>
-          <w:rFonts w:ascii="Times New Roman" w:eastAsia="Times New Roman" w:hAnsi="Times New Roman" w:cs="Times New Roman"/>
-        </w:rPr>
-        <w:t xml:space="preserve">{{mak}}.                      </w:t>
-      </w:r>
-    </w:p>
-    <w:p>
-      <w:pPr>
-        <w:widowControl w:val="0"/>
-        <w:spacing w:line="240" w:lineRule="auto"/>
-        <w:ind w:left="2410" w:hanging="425"/>
-        <w:jc w:val="both"/>
-        <w:rPr>
-          <w:rFonts w:ascii="Times New Roman" w:eastAsia="Times New Roman" w:hAnsi="Times New Roman" w:cs="Times New Roman"/>
-        </w:rPr>
-      </w:pPr>
-      <w:r>
-        <w:rPr>
-          <w:rFonts w:ascii="Times New Roman" w:eastAsia="Times New Roman" w:hAnsi="Times New Roman" w:cs="Times New Roman"/>
-        </w:rPr>
-        <w:t xml:space="preserve">3. </w:t>
-      </w:r>
-      <w:r>
-        <w:rPr>
-          <w:rFonts w:ascii="Times New Roman" w:eastAsia="Times New Roman" w:hAnsi="Times New Roman" w:cs="Times New Roman"/>
-        </w:rPr>
-        <w:tab/>
-        <w:t>Segera membuat laporan tertulis mengenai hasil – hasil pelaksanaan Tugas Kepada Sekretaris Ditjen/Direktur Penyediaan Lahan.</w:t>
-      </w:r>
-    </w:p>
+    <w:tbl>
+      <w:tblPr>
+        <w:tblStyle w:val="TableGrid"/>
+        <w:tblW w:w="9067" w:type="dxa"/>
+        <w:tblBorders>
+          <w:top w:val="none" w:sz="0" w:space="0" w:color="auto"/>
+          <w:left w:val="none" w:sz="0" w:space="0" w:color="auto"/>
+          <w:bottom w:val="none" w:sz="0" w:space="0" w:color="auto"/>
+          <w:right w:val="none" w:sz="0" w:space="0" w:color="auto"/>
+          <w:insideH w:val="none" w:sz="0" w:space="0" w:color="auto"/>
+          <w:insideV w:val="none" w:sz="0" w:space="0" w:color="auto"/>
+        </w:tblBorders>
+        <w:tblLook w:val="04A0" w:firstRow="1" w:lastRow="0" w:firstColumn="1" w:lastColumn="0" w:noHBand="0" w:noVBand="1"/>
+      </w:tblPr>
+      <w:tblGrid>
+        <w:gridCol w:w="1555"/>
+        <w:gridCol w:w="283"/>
+        <w:gridCol w:w="7229"/>
+      </w:tblGrid>
+      <w:tr>
+        <w:tc>
+          <w:tcPr>
+            <w:tcW w:w="1555" w:type="dxa"/>
+          </w:tcPr>
+          <w:p>
+            <w:pPr>
+              <w:widowControl w:val="0"/>
+              <w:tabs>
+                <w:tab w:val="left" w:pos="1701"/>
+                <w:tab w:val="left" w:pos="1985"/>
+                <w:tab w:val="left" w:pos="2410"/>
+              </w:tabs>
+              <w:spacing w:line="276" w:lineRule="auto"/>
+              <w:jc w:val="both"/>
+              <w:rPr>
+                <w:rFonts w:ascii="Times New Roman" w:eastAsia="Times New Roman" w:hAnsi="Times New Roman" w:cs="Times New Roman"/>
+              </w:rPr>
+            </w:pPr>
+            <w:r>
+              <w:rPr>
+                <w:rFonts w:ascii="Times New Roman" w:eastAsia="Times New Roman" w:hAnsi="Times New Roman" w:cs="Times New Roman"/>
+              </w:rPr>
+              <w:t>Untuk</w:t>
+            </w:r>
+          </w:p>
+        </w:tc>
+        <w:tc>
+          <w:tcPr>
+            <w:tcW w:w="283" w:type="dxa"/>
+          </w:tcPr>
+          <w:p>
+            <w:pPr>
+              <w:widowControl w:val="0"/>
+              <w:tabs>
+                <w:tab w:val="left" w:pos="1701"/>
+                <w:tab w:val="left" w:pos="1985"/>
+                <w:tab w:val="left" w:pos="2410"/>
+              </w:tabs>
+              <w:spacing w:line="276" w:lineRule="auto"/>
+              <w:jc w:val="both"/>
+              <w:rPr>
+                <w:rFonts w:ascii="Times New Roman" w:eastAsia="Times New Roman" w:hAnsi="Times New Roman" w:cs="Times New Roman"/>
+              </w:rPr>
+            </w:pPr>
+            <w:r>
+              <w:rPr>
+                <w:rFonts w:ascii="Times New Roman" w:eastAsia="Times New Roman" w:hAnsi="Times New Roman" w:cs="Times New Roman"/>
+              </w:rPr>
+              <w:t>:</w:t>
+            </w:r>
+          </w:p>
+        </w:tc>
+        <w:tc>
+          <w:tcPr>
+            <w:tcW w:w="7229" w:type="dxa"/>
+          </w:tcPr>
+          <w:p>
+            <w:pPr>
+              <w:pStyle w:val="ListParagraph"/>
+              <w:numPr>
+                <w:ilvl w:val="0"/>
+                <w:numId w:val="3"/>
+              </w:numPr>
+              <w:spacing w:line="276" w:lineRule="auto"/>
+              <w:ind w:left="605"/>
+              <w:jc w:val="both"/>
+              <w:rPr>
+                <w:rFonts w:ascii="Times New Roman" w:eastAsia="Times New Roman" w:hAnsi="Times New Roman" w:cs="Times New Roman"/>
+              </w:rPr>
+            </w:pPr>
+            <w:r>
+              <w:rPr>
+                <w:rFonts w:ascii="Times New Roman" w:eastAsia="Times New Roman" w:hAnsi="Times New Roman" w:cs="Times New Roman"/>
+              </w:rPr>
+              <w:t>Melaksanakan tugas dalam rangka {{kegiatan}}.</w:t>
+            </w:r>
+          </w:p>
+          <w:p>
+            <w:pPr>
+              <w:pStyle w:val="ListParagraph"/>
+              <w:numPr>
+                <w:ilvl w:val="0"/>
+                <w:numId w:val="3"/>
+              </w:numPr>
+              <w:spacing w:line="276" w:lineRule="auto"/>
+              <w:ind w:left="605"/>
+              <w:jc w:val="both"/>
+              <w:rPr>
+                <w:rFonts w:ascii="Times New Roman" w:eastAsia="Times New Roman" w:hAnsi="Times New Roman" w:cs="Times New Roman"/>
+              </w:rPr>
+            </w:pPr>
+            <w:r>
+              <w:rPr>
+                <w:rFonts w:ascii="Times New Roman" w:eastAsia="Times New Roman" w:hAnsi="Times New Roman" w:cs="Times New Roman"/>
+              </w:rPr>
+              <w:t>Biaya perjalanan dinas diberikan pada DIPA Petikan Satker (081.13) Direktorat Jenderal Lahan dan Irigasi Pertanian TA.2025 {{mak}}.</w:t>
+            </w:r>
+          </w:p>
+          <w:p>
+            <w:pPr>
+              <w:pStyle w:val="ListParagraph"/>
+              <w:numPr>
+                <w:ilvl w:val="0"/>
+                <w:numId w:val="3"/>
+              </w:numPr>
+              <w:spacing w:line="276" w:lineRule="auto"/>
+              <w:ind w:left="605"/>
+              <w:jc w:val="both"/>
+              <w:rPr>
+                <w:rFonts w:ascii="Times New Roman" w:eastAsia="Times New Roman" w:hAnsi="Times New Roman" w:cs="Times New Roman"/>
+              </w:rPr>
+            </w:pPr>
+            <w:r>
+              <w:rPr>
+                <w:rFonts w:ascii="Times New Roman" w:eastAsia="Times New Roman" w:hAnsi="Times New Roman" w:cs="Times New Roman"/>
+              </w:rPr>
+              <w:t>Segera membuat laporan tertulis mengenai hasil – hasil pel</w:t>
+            </w:r>
+            <w:r>
+              <w:rPr>
+                <w:rFonts w:ascii="Times New Roman" w:eastAsia="Times New Roman" w:hAnsi="Times New Roman" w:cs="Times New Roman"/>
+              </w:rPr>
+              <w:t>aksanaan Tugas Kepada Sekretaris Ditjen/Direktur Penyediaan Lahan.</w:t>
+            </w:r>
+          </w:p>
+        </w:tc>
+      </w:tr>
+    </w:tbl>
     <w:p>
       <w:pPr>
         <w:widowControl w:val="0"/>
@@ -1169,6 +1382,287 @@
     </w:sectPr>
   </w:body>
 </w:document>
+</file>
+
+<file path=word/numbering.xml><?xml version="1.0" encoding="utf-8"?>
+<w:numbering xmlns:wpc="http://schemas.microsoft.com/office/word/2010/wordprocessingCanvas" xmlns:cx="http://schemas.microsoft.com/office/drawing/2014/chartex" xmlns:cx1="http://schemas.microsoft.com/office/drawing/2015/9/8/chartex" xmlns:cx2="http://schemas.microsoft.com/office/drawing/2015/10/21/chartex" xmlns:cx3="http://schemas.microsoft.com/office/drawing/2016/5/9/chartex" xmlns:cx4="http://schemas.microsoft.com/office/drawing/2016/5/10/chartex" xmlns:cx5="http://schemas.microsoft.com/office/drawing/2016/5/11/chartex" xmlns:cx6="http://schemas.microsoft.com/office/drawing/2016/5/12/chartex" xmlns:cx7="http://schemas.microsoft.com/office/drawing/2016/5/13/chartex" xmlns:cx8="http://schemas.microsoft.com/office/drawing/2016/5/14/chartex" xmlns:mc="http://schemas.openxmlformats.org/markup-compatibility/2006" xmlns:aink="http://schemas.microsoft.com/office/drawing/2016/ink" xmlns:am3d="http://schemas.microsoft.com/office/drawing/2017/model3d" xmlns:o="urn:schemas-microsoft-com:office:office" xmlns:oel="http://schemas.microsoft.com/office/2019/extlst" xmlns:r="http://schemas.openxmlformats.org/officeDocument/2006/relationships" xmlns:m="http://schemas.openxmlformats.org/officeDocument/2006/math" xmlns:v="urn:schemas-microsoft-com:vml" xmlns:wp14="http://schemas.microsoft.com/office/word/2010/wordprocessingDrawing" xmlns:wp="http://schemas.openxmlformats.org/drawingml/2006/wordprocessingDrawing" xmlns:w10="urn:schemas-microsoft-com:office:word" xmlns:w="http://schemas.openxmlformats.org/wordprocessingml/2006/main" xmlns:w14="http://schemas.microsoft.com/office/word/2010/wordml" xmlns:w15="http://schemas.microsoft.com/office/word/2012/wordml" xmlns:w16cex="http://schemas.microsoft.com/office/word/2018/wordml/cex" xmlns:w16cid="http://schemas.microsoft.com/office/word/2016/wordml/cid" xmlns:w16="http://schemas.microsoft.com/office/word/2018/wordml" xmlns:w16du="http://schemas.microsoft.com/office/word/2023/wordml/word16du" xmlns:w16sdtdh="http://schemas.microsoft.com/office/word/2020/wordml/sdtdatahash" xmlns:w16sdtfl="http://schemas.microsoft.com/office/word/2024/wordml/sdtformatlock" xmlns:w16se="http://schemas.microsoft.com/office/word/2015/wordml/symex" xmlns:wpg="http://schemas.microsoft.com/office/word/2010/wordprocessingGroup" xmlns:wpi="http://schemas.microsoft.com/office/word/2010/wordprocessingInk" xmlns:wne="http://schemas.microsoft.com/office/word/2006/wordml" xmlns:wps="http://schemas.microsoft.com/office/word/2010/wordprocessingShape" mc:Ignorable="w14 w15 w16se w16cid w16 w16cex w16sdtdh w16sdtfl w16du wp14">
+  <w:abstractNum w:abstractNumId="0" w15:restartNumberingAfterBreak="0">
+    <w:nsid w:val="53B938E9"/>
+    <w:multiLevelType w:val="hybridMultilevel"/>
+    <w:tmpl w:val="7D2EC668"/>
+    <w:lvl w:ilvl="0" w:tplc="0409000F">
+      <w:start w:val="1"/>
+      <w:numFmt w:val="decimal"/>
+      <w:lvlText w:val="%1."/>
+      <w:lvlJc w:val="left"/>
+      <w:pPr>
+        <w:ind w:left="720" w:hanging="360"/>
+      </w:pPr>
+      <w:rPr>
+        <w:rFonts w:hint="default"/>
+      </w:rPr>
+    </w:lvl>
+    <w:lvl w:ilvl="1" w:tplc="04090019" w:tentative="1">
+      <w:start w:val="1"/>
+      <w:numFmt w:val="lowerLetter"/>
+      <w:lvlText w:val="%2."/>
+      <w:lvlJc w:val="left"/>
+      <w:pPr>
+        <w:ind w:left="1440" w:hanging="360"/>
+      </w:pPr>
+    </w:lvl>
+    <w:lvl w:ilvl="2" w:tplc="0409001B" w:tentative="1">
+      <w:start w:val="1"/>
+      <w:numFmt w:val="lowerRoman"/>
+      <w:lvlText w:val="%3."/>
+      <w:lvlJc w:val="right"/>
+      <w:pPr>
+        <w:ind w:left="2160" w:hanging="180"/>
+      </w:pPr>
+    </w:lvl>
+    <w:lvl w:ilvl="3" w:tplc="0409000F" w:tentative="1">
+      <w:start w:val="1"/>
+      <w:numFmt w:val="decimal"/>
+      <w:lvlText w:val="%4."/>
+      <w:lvlJc w:val="left"/>
+      <w:pPr>
+        <w:ind w:left="2880" w:hanging="360"/>
+      </w:pPr>
+    </w:lvl>
+    <w:lvl w:ilvl="4" w:tplc="04090019" w:tentative="1">
+      <w:start w:val="1"/>
+      <w:numFmt w:val="lowerLetter"/>
+      <w:lvlText w:val="%5."/>
+      <w:lvlJc w:val="left"/>
+      <w:pPr>
+        <w:ind w:left="3600" w:hanging="360"/>
+      </w:pPr>
+    </w:lvl>
+    <w:lvl w:ilvl="5" w:tplc="0409001B" w:tentative="1">
+      <w:start w:val="1"/>
+      <w:numFmt w:val="lowerRoman"/>
+      <w:lvlText w:val="%6."/>
+      <w:lvlJc w:val="right"/>
+      <w:pPr>
+        <w:ind w:left="4320" w:hanging="180"/>
+      </w:pPr>
+    </w:lvl>
+    <w:lvl w:ilvl="6" w:tplc="0409000F" w:tentative="1">
+      <w:start w:val="1"/>
+      <w:numFmt w:val="decimal"/>
+      <w:lvlText w:val="%7."/>
+      <w:lvlJc w:val="left"/>
+      <w:pPr>
+        <w:ind w:left="5040" w:hanging="360"/>
+      </w:pPr>
+    </w:lvl>
+    <w:lvl w:ilvl="7" w:tplc="04090019" w:tentative="1">
+      <w:start w:val="1"/>
+      <w:numFmt w:val="lowerLetter"/>
+      <w:lvlText w:val="%8."/>
+      <w:lvlJc w:val="left"/>
+      <w:pPr>
+        <w:ind w:left="5760" w:hanging="360"/>
+      </w:pPr>
+    </w:lvl>
+    <w:lvl w:ilvl="8" w:tplc="0409001B" w:tentative="1">
+      <w:start w:val="1"/>
+      <w:numFmt w:val="lowerRoman"/>
+      <w:lvlText w:val="%9."/>
+      <w:lvlJc w:val="right"/>
+      <w:pPr>
+        <w:ind w:left="6480" w:hanging="180"/>
+      </w:pPr>
+    </w:lvl>
+  </w:abstractNum>
+  <w:abstractNum w:abstractNumId="1" w15:restartNumberingAfterBreak="0">
+    <w:nsid w:val="6F111DD2"/>
+    <w:multiLevelType w:val="hybridMultilevel"/>
+    <w:tmpl w:val="9DC87FAA"/>
+    <w:lvl w:ilvl="0" w:tplc="0409000F">
+      <w:start w:val="1"/>
+      <w:numFmt w:val="decimal"/>
+      <w:lvlText w:val="%1."/>
+      <w:lvlJc w:val="left"/>
+      <w:pPr>
+        <w:ind w:left="720" w:hanging="360"/>
+      </w:pPr>
+      <w:rPr>
+        <w:rFonts w:hint="default"/>
+      </w:rPr>
+    </w:lvl>
+    <w:lvl w:ilvl="1" w:tplc="04090019" w:tentative="1">
+      <w:start w:val="1"/>
+      <w:numFmt w:val="lowerLetter"/>
+      <w:lvlText w:val="%2."/>
+      <w:lvlJc w:val="left"/>
+      <w:pPr>
+        <w:ind w:left="1440" w:hanging="360"/>
+      </w:pPr>
+    </w:lvl>
+    <w:lvl w:ilvl="2" w:tplc="0409001B" w:tentative="1">
+      <w:start w:val="1"/>
+      <w:numFmt w:val="lowerRoman"/>
+      <w:lvlText w:val="%3."/>
+      <w:lvlJc w:val="right"/>
+      <w:pPr>
+        <w:ind w:left="2160" w:hanging="180"/>
+      </w:pPr>
+    </w:lvl>
+    <w:lvl w:ilvl="3" w:tplc="0409000F" w:tentative="1">
+      <w:start w:val="1"/>
+      <w:numFmt w:val="decimal"/>
+      <w:lvlText w:val="%4."/>
+      <w:lvlJc w:val="left"/>
+      <w:pPr>
+        <w:ind w:left="2880" w:hanging="360"/>
+      </w:pPr>
+    </w:lvl>
+    <w:lvl w:ilvl="4" w:tplc="04090019" w:tentative="1">
+      <w:start w:val="1"/>
+      <w:numFmt w:val="lowerLetter"/>
+      <w:lvlText w:val="%5."/>
+      <w:lvlJc w:val="left"/>
+      <w:pPr>
+        <w:ind w:left="3600" w:hanging="360"/>
+      </w:pPr>
+    </w:lvl>
+    <w:lvl w:ilvl="5" w:tplc="0409001B" w:tentative="1">
+      <w:start w:val="1"/>
+      <w:numFmt w:val="lowerRoman"/>
+      <w:lvlText w:val="%6."/>
+      <w:lvlJc w:val="right"/>
+      <w:pPr>
+        <w:ind w:left="4320" w:hanging="180"/>
+      </w:pPr>
+    </w:lvl>
+    <w:lvl w:ilvl="6" w:tplc="0409000F" w:tentative="1">
+      <w:start w:val="1"/>
+      <w:numFmt w:val="decimal"/>
+      <w:lvlText w:val="%7."/>
+      <w:lvlJc w:val="left"/>
+      <w:pPr>
+        <w:ind w:left="5040" w:hanging="360"/>
+      </w:pPr>
+    </w:lvl>
+    <w:lvl w:ilvl="7" w:tplc="04090019" w:tentative="1">
+      <w:start w:val="1"/>
+      <w:numFmt w:val="lowerLetter"/>
+      <w:lvlText w:val="%8."/>
+      <w:lvlJc w:val="left"/>
+      <w:pPr>
+        <w:ind w:left="5760" w:hanging="360"/>
+      </w:pPr>
+    </w:lvl>
+    <w:lvl w:ilvl="8" w:tplc="0409001B" w:tentative="1">
+      <w:start w:val="1"/>
+      <w:numFmt w:val="lowerRoman"/>
+      <w:lvlText w:val="%9."/>
+      <w:lvlJc w:val="right"/>
+      <w:pPr>
+        <w:ind w:left="6480" w:hanging="180"/>
+      </w:pPr>
+    </w:lvl>
+  </w:abstractNum>
+  <w:abstractNum w:abstractNumId="2" w15:restartNumberingAfterBreak="0">
+    <w:nsid w:val="77281D63"/>
+    <w:multiLevelType w:val="hybridMultilevel"/>
+    <w:tmpl w:val="A1EAFCA0"/>
+    <w:lvl w:ilvl="0" w:tplc="04090019">
+      <w:start w:val="1"/>
+      <w:numFmt w:val="lowerLetter"/>
+      <w:lvlText w:val="%1."/>
+      <w:lvlJc w:val="left"/>
+      <w:pPr>
+        <w:ind w:left="720" w:hanging="360"/>
+      </w:pPr>
+      <w:rPr>
+        <w:rFonts w:hint="default"/>
+      </w:rPr>
+    </w:lvl>
+    <w:lvl w:ilvl="1" w:tplc="04090019" w:tentative="1">
+      <w:start w:val="1"/>
+      <w:numFmt w:val="lowerLetter"/>
+      <w:lvlText w:val="%2."/>
+      <w:lvlJc w:val="left"/>
+      <w:pPr>
+        <w:ind w:left="1440" w:hanging="360"/>
+      </w:pPr>
+    </w:lvl>
+    <w:lvl w:ilvl="2" w:tplc="0409001B" w:tentative="1">
+      <w:start w:val="1"/>
+      <w:numFmt w:val="lowerRoman"/>
+      <w:lvlText w:val="%3."/>
+      <w:lvlJc w:val="right"/>
+      <w:pPr>
+        <w:ind w:left="2160" w:hanging="180"/>
+      </w:pPr>
+    </w:lvl>
+    <w:lvl w:ilvl="3" w:tplc="0409000F" w:tentative="1">
+      <w:start w:val="1"/>
+      <w:numFmt w:val="decimal"/>
+      <w:lvlText w:val="%4."/>
+      <w:lvlJc w:val="left"/>
+      <w:pPr>
+        <w:ind w:left="2880" w:hanging="360"/>
+      </w:pPr>
+    </w:lvl>
+    <w:lvl w:ilvl="4" w:tplc="04090019" w:tentative="1">
+      <w:start w:val="1"/>
+      <w:numFmt w:val="lowerLetter"/>
+      <w:lvlText w:val="%5."/>
+      <w:lvlJc w:val="left"/>
+      <w:pPr>
+        <w:ind w:left="3600" w:hanging="360"/>
+      </w:pPr>
+    </w:lvl>
+    <w:lvl w:ilvl="5" w:tplc="0409001B" w:tentative="1">
+      <w:start w:val="1"/>
+      <w:numFmt w:val="lowerRoman"/>
+      <w:lvlText w:val="%6."/>
+      <w:lvlJc w:val="right"/>
+      <w:pPr>
+        <w:ind w:left="4320" w:hanging="180"/>
+      </w:pPr>
+    </w:lvl>
+    <w:lvl w:ilvl="6" w:tplc="0409000F" w:tentative="1">
+      <w:start w:val="1"/>
+      <w:numFmt w:val="decimal"/>
+      <w:lvlText w:val="%7."/>
+      <w:lvlJc w:val="left"/>
+      <w:pPr>
+        <w:ind w:left="5040" w:hanging="360"/>
+      </w:pPr>
+    </w:lvl>
+    <w:lvl w:ilvl="7" w:tplc="04090019" w:tentative="1">
+      <w:start w:val="1"/>
+      <w:numFmt w:val="lowerLetter"/>
+      <w:lvlText w:val="%8."/>
+      <w:lvlJc w:val="left"/>
+      <w:pPr>
+        <w:ind w:left="5760" w:hanging="360"/>
+      </w:pPr>
+    </w:lvl>
+    <w:lvl w:ilvl="8" w:tplc="0409001B" w:tentative="1">
+      <w:start w:val="1"/>
+      <w:numFmt w:val="lowerRoman"/>
+      <w:lvlText w:val="%9."/>
+      <w:lvlJc w:val="right"/>
+      <w:pPr>
+        <w:ind w:left="6480" w:hanging="180"/>
+      </w:pPr>
+    </w:lvl>
+  </w:abstractNum>
+  <w:num w:numId="1" w16cid:durableId="846479702">
+    <w:abstractNumId w:val="2"/>
+  </w:num>
+  <w:num w:numId="2" w16cid:durableId="834413561">
+    <w:abstractNumId w:val="0"/>
+  </w:num>
+  <w:num w:numId="3" w16cid:durableId="1787040560">
+    <w:abstractNumId w:val="1"/>
+  </w:num>
+</w:numbering>
 </file>
 
 <file path=word/styles.xml><?xml version="1.0" encoding="utf-8"?>
@@ -1781,6 +2275,36 @@
       </w:tblCellMar>
     </w:tblPr>
   </w:style>
+  <w:style w:type="table" w:styleId="TableGrid">
+    <w:name w:val="Table Grid"/>
+    <w:basedOn w:val="TableNormal"/>
+    <w:uiPriority w:val="39"/>
+    <w:rsid w:val="00A279A2"/>
+    <w:pPr>
+      <w:spacing w:line="240" w:lineRule="auto"/>
+    </w:pPr>
+    <w:tblPr>
+      <w:tblBorders>
+        <w:top w:val="single" w:sz="4" w:space="0" w:color="auto"/>
+        <w:left w:val="single" w:sz="4" w:space="0" w:color="auto"/>
+        <w:bottom w:val="single" w:sz="4" w:space="0" w:color="auto"/>
+        <w:right w:val="single" w:sz="4" w:space="0" w:color="auto"/>
+        <w:insideH w:val="single" w:sz="4" w:space="0" w:color="auto"/>
+        <w:insideV w:val="single" w:sz="4" w:space="0" w:color="auto"/>
+      </w:tblBorders>
+    </w:tblPr>
+  </w:style>
+  <w:style w:type="paragraph" w:styleId="ListParagraph">
+    <w:name w:val="List Paragraph"/>
+    <w:basedOn w:val="Normal"/>
+    <w:uiPriority w:val="34"/>
+    <w:qFormat/>
+    <w:rsid w:val="00A279A2"/>
+    <w:pPr>
+      <w:ind w:left="720"/>
+      <w:contextualSpacing/>
+    </w:pPr>
+  </w:style>
 </w:styles>
 </file>
 

</xml_diff>